<commit_message>
Update Java skill to remove version and reduce hero headline font size
</commit_message>
<xml_diff>
--- a/assets/Akshaya-Java-AI-Integration-Resume.docx
+++ b/assets/Akshaya-Java-AI-Integration-Resume.docx
@@ -13,6 +13,15 @@
       </w:pPr>
       <w:r>
         <w:rPr/>
+        <w:t xml:space="preserve"> </w:t>
+      </w:r>
+    </w:p>
+    <w:p>
+      <w:pPr>
+        <w:spacing w:lineRule="auto"/>
+      </w:pPr>
+      <w:r>
+        <w:rPr/>
         <w:t xml:space="preserve"/>
       </w:r>
     </w:p>
@@ -424,7 +433,7 @@
       </w:r>
       <w:r>
         <w:rPr/>
-        <w:t xml:space="preserve"> Java (11-21), Spring Boot, Java Servlets, REST APIs, Multithreading, Low-Level Design (LLD), Concurrent Data Structures.</w:t>
+        <w:t xml:space="preserve"> Java, Spring Boot, Java Servlets, REST APIs, Multithreading, Low-Level Design (LLD), Concurrent Data Structures.</w:t>
       </w:r>
     </w:p>
     <w:p>

</xml_diff>